<commit_message>
add spec driven dev lines to resume
</commit_message>
<xml_diff>
--- a/client/public/BenjaminWakefield-Resume.docx
+++ b/client/public/BenjaminWakefield-Resume.docx
@@ -681,7 +681,7 @@
                                 <w:i/>
                                 <w:iCs/>
                               </w:rPr>
-                              <w:t xml:space="preserve">Versatile Full Stack Software Engineer with proven experience across cloud migrations, platform modernisation, high-throughput distributed systems, and DevOps automation. Recognised for technical breadth and reliability, from delivering scalable backend services in Go and .NET to </w:t>
+                              <w:t>Versatile Full Stack Software Engineer with proven experience across cloud migrations, platform modernisation, high-throughput distributed systems, DevOps automation</w:t>
                             </w:r>
                             <w:r>
                               <w:rPr>
@@ -690,7 +690,7 @@
                                 <w:i/>
                                 <w:iCs/>
                               </w:rPr>
-                              <w:t>maintaining</w:t>
+                              <w:t xml:space="preserve"> and Spec Driven Development</w:t>
                             </w:r>
                             <w:r>
                               <w:rPr>
@@ -699,7 +699,43 @@
                                 <w:i/>
                                 <w:iCs/>
                               </w:rPr>
-                              <w:t xml:space="preserve"> React frontends. Passionate about designing performant, well-tested solutions, driving cross-team adoption of new tools, and delivering continuous improvement across complex, multi-region systems.</w:t>
+                              <w:t xml:space="preserve">. Recognised for technical breadth and reliability, from delivering scalable backend services in Go and .NET to </w:t>
+                            </w:r>
+                            <w:r>
+                              <w:rPr>
+                                <w:b/>
+                                <w:bCs/>
+                                <w:i/>
+                                <w:iCs/>
+                              </w:rPr>
+                              <w:t>maintaining</w:t>
+                            </w:r>
+                            <w:r>
+                              <w:rPr>
+                                <w:b/>
+                                <w:bCs/>
+                                <w:i/>
+                                <w:iCs/>
+                              </w:rPr>
+                              <w:t xml:space="preserve"> React</w:t>
+                            </w:r>
+                            <w:r>
+                              <w:rPr>
+                                <w:b/>
+                                <w:bCs/>
+                                <w:i/>
+                                <w:iCs/>
+                              </w:rPr>
+                              <w:t>/Typescript</w:t>
+                            </w:r>
+                            <w:r>
+                              <w:rPr>
+                                <w:b/>
+                                <w:bCs/>
+                                <w:i/>
+                                <w:iCs/>
+                              </w:rPr>
+                              <w:t xml:space="preserve"> frontends. Passionate about designing performant, well-tested solutions, driving cross-team adoption of new tools, and delivering continuous improvement across complex, multi-region systems.</w:t>
                             </w:r>
                           </w:p>
                         </w:txbxContent>
@@ -721,7 +757,11 @@
           </mc:Choice>
           <mc:Fallback>
             <w:pict>
-              <v:shape w14:anchorId="41BCAB7E" id="_x0000_s1027" type="#_x0000_t202" style="position:absolute;left:0;text-align:left;margin-left:-21pt;margin-top:78.7pt;width:556.5pt;height:58.5pt;z-index:251667456;visibility:visible;mso-wrap-style:square;mso-width-percent:0;mso-height-percent:0;mso-wrap-distance-left:9pt;mso-wrap-distance-top:3.6pt;mso-wrap-distance-right:9pt;mso-wrap-distance-bottom:3.6pt;mso-position-horizontal:absolute;mso-position-horizontal-relative:margin;mso-position-vertical:absolute;mso-position-vertical-relative:text;mso-width-percent:0;mso-height-percent:0;mso-width-relative:margin;mso-height-relative:margin;v-text-anchor:top" o:gfxdata="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" filled="f" stroked="f">
+              <v:shapetype w14:anchorId="41BCAB7E" id="_x0000_t202" coordsize="21600,21600" o:spt="202" path="m,l,21600r21600,l21600,xe">
+                <v:stroke joinstyle="miter"/>
+                <v:path gradientshapeok="t" o:connecttype="rect"/>
+              </v:shapetype>
+              <v:shape id="_x0000_s1027" type="#_x0000_t202" style="position:absolute;left:0;text-align:left;margin-left:-21pt;margin-top:78.7pt;width:556.5pt;height:58.5pt;z-index:251667456;visibility:visible;mso-wrap-style:square;mso-width-percent:0;mso-height-percent:0;mso-wrap-distance-left:9pt;mso-wrap-distance-top:3.6pt;mso-wrap-distance-right:9pt;mso-wrap-distance-bottom:3.6pt;mso-position-horizontal:absolute;mso-position-horizontal-relative:margin;mso-position-vertical:absolute;mso-position-vertical-relative:text;mso-width-percent:0;mso-height-percent:0;mso-width-relative:margin;mso-height-relative:margin;v-text-anchor:top" o:gfxdata="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" filled="f" stroked="f">
                 <v:textbox>
                   <w:txbxContent>
                     <w:p>
@@ -741,7 +781,7 @@
                           <w:i/>
                           <w:iCs/>
                         </w:rPr>
-                        <w:t xml:space="preserve">Versatile Full Stack Software Engineer with proven experience across cloud migrations, platform modernisation, high-throughput distributed systems, and DevOps automation. Recognised for technical breadth and reliability, from delivering scalable backend services in Go and .NET to </w:t>
+                        <w:t>Versatile Full Stack Software Engineer with proven experience across cloud migrations, platform modernisation, high-throughput distributed systems, DevOps automation</w:t>
                       </w:r>
                       <w:r>
                         <w:rPr>
@@ -750,7 +790,7 @@
                           <w:i/>
                           <w:iCs/>
                         </w:rPr>
-                        <w:t>maintaining</w:t>
+                        <w:t xml:space="preserve"> and Spec Driven Development</w:t>
                       </w:r>
                       <w:r>
                         <w:rPr>
@@ -759,7 +799,43 @@
                           <w:i/>
                           <w:iCs/>
                         </w:rPr>
-                        <w:t xml:space="preserve"> React frontends. Passionate about designing performant, well-tested solutions, driving cross-team adoption of new tools, and delivering continuous improvement across complex, multi-region systems.</w:t>
+                        <w:t xml:space="preserve">. Recognised for technical breadth and reliability, from delivering scalable backend services in Go and .NET to </w:t>
+                      </w:r>
+                      <w:r>
+                        <w:rPr>
+                          <w:b/>
+                          <w:bCs/>
+                          <w:i/>
+                          <w:iCs/>
+                        </w:rPr>
+                        <w:t>maintaining</w:t>
+                      </w:r>
+                      <w:r>
+                        <w:rPr>
+                          <w:b/>
+                          <w:bCs/>
+                          <w:i/>
+                          <w:iCs/>
+                        </w:rPr>
+                        <w:t xml:space="preserve"> React</w:t>
+                      </w:r>
+                      <w:r>
+                        <w:rPr>
+                          <w:b/>
+                          <w:bCs/>
+                          <w:i/>
+                          <w:iCs/>
+                        </w:rPr>
+                        <w:t>/Typescript</w:t>
+                      </w:r>
+                      <w:r>
+                        <w:rPr>
+                          <w:b/>
+                          <w:bCs/>
+                          <w:i/>
+                          <w:iCs/>
+                        </w:rPr>
+                        <w:t xml:space="preserve"> frontends. Passionate about designing performant, well-tested solutions, driving cross-team adoption of new tools, and delivering continuous improvement across complex, multi-region systems.</w:t>
                       </w:r>
                     </w:p>
                   </w:txbxContent>
@@ -800,16 +876,16 @@
         <mc:AlternateContent>
           <mc:Choice Requires="wps">
             <w:drawing>
-              <wp:anchor distT="45720" distB="45720" distL="114300" distR="114300" simplePos="0" relativeHeight="251677696" behindDoc="0" locked="0" layoutInCell="1" allowOverlap="1" wp14:anchorId="0DB68382" wp14:editId="14BFD0C9">
+              <wp:anchor distT="45720" distB="45720" distL="114300" distR="114300" simplePos="0" relativeHeight="251677696" behindDoc="0" locked="0" layoutInCell="1" allowOverlap="1" wp14:anchorId="0DB68382" wp14:editId="1E183AA3">
                 <wp:simplePos x="0" y="0"/>
                 <wp:positionH relativeFrom="margin">
-                  <wp:posOffset>3299613</wp:posOffset>
+                  <wp:posOffset>3302635</wp:posOffset>
                 </wp:positionH>
                 <wp:positionV relativeFrom="paragraph">
-                  <wp:posOffset>1655115</wp:posOffset>
+                  <wp:posOffset>1656715</wp:posOffset>
                 </wp:positionV>
-                <wp:extent cx="1175385" cy="1403350"/>
-                <wp:effectExtent l="0" t="0" r="0" b="6350"/>
+                <wp:extent cx="1175385" cy="1630680"/>
+                <wp:effectExtent l="0" t="0" r="0" b="0"/>
                 <wp:wrapSquare wrapText="bothSides"/>
                 <wp:docPr id="1" name="Text Box 2"/>
                 <wp:cNvGraphicFramePr>
@@ -824,7 +900,7 @@
                       <wps:spPr bwMode="auto">
                         <a:xfrm>
                           <a:off x="0" y="0"/>
-                          <a:ext cx="1175385" cy="1403350"/>
+                          <a:ext cx="1175385" cy="1630680"/>
                         </a:xfrm>
                         <a:prstGeom prst="rect">
                           <a:avLst/>
@@ -934,6 +1010,73 @@
                                 <w:iCs/>
                               </w:rPr>
                               <w:t>Copilot</w:t>
+                            </w:r>
+                          </w:p>
+                          <w:p>
+                            <w:pPr>
+                              <w:spacing w:after="0"/>
+                              <w:rPr>
+                                <w:i/>
+                                <w:iCs/>
+                              </w:rPr>
+                            </w:pPr>
+                            <w:r>
+                              <w:rPr>
+                                <w:i/>
+                                <w:iCs/>
+                              </w:rPr>
+                              <w:t xml:space="preserve">  </w:t>
+                            </w:r>
+                            <w:r>
+                              <w:rPr>
+                                <w:i/>
+                                <w:iCs/>
+                              </w:rPr>
+                              <w:t xml:space="preserve">• </w:t>
+                            </w:r>
+                            <w:r>
+                              <w:rPr>
+                                <w:i/>
+                                <w:iCs/>
+                              </w:rPr>
+                              <w:t>Kiro</w:t>
+                            </w:r>
+                          </w:p>
+                          <w:p>
+                            <w:pPr>
+                              <w:spacing w:after="0"/>
+                              <w:rPr>
+                                <w:i/>
+                                <w:iCs/>
+                              </w:rPr>
+                            </w:pPr>
+                            <w:r>
+                              <w:rPr>
+                                <w:i/>
+                                <w:iCs/>
+                              </w:rPr>
+                              <w:t xml:space="preserve"> </w:t>
+                            </w:r>
+                            <w:r>
+                              <w:rPr>
+                                <w:i/>
+                                <w:iCs/>
+                              </w:rPr>
+                              <w:t xml:space="preserve"> </w:t>
+                            </w:r>
+                            <w:r>
+                              <w:rPr>
+                                <w:i/>
+                                <w:iCs/>
+                              </w:rPr>
+                              <w:t xml:space="preserve">• </w:t>
+                            </w:r>
+                            <w:r>
+                              <w:rPr>
+                                <w:i/>
+                                <w:iCs/>
+                              </w:rPr>
+                              <w:t>Claude</w:t>
                             </w:r>
                           </w:p>
                           <w:p>
@@ -1035,7 +1178,7 @@
           </mc:Choice>
           <mc:Fallback>
             <w:pict>
-              <v:shape w14:anchorId="0DB68382" id="_x0000_s1028" type="#_x0000_t202" style="position:absolute;left:0;text-align:left;margin-left:259.8pt;margin-top:130.3pt;width:92.55pt;height:110.5pt;z-index:251677696;visibility:visible;mso-wrap-style:square;mso-width-percent:0;mso-height-percent:0;mso-wrap-distance-left:9pt;mso-wrap-distance-top:3.6pt;mso-wrap-distance-right:9pt;mso-wrap-distance-bottom:3.6pt;mso-position-horizontal:absolute;mso-position-horizontal-relative:margin;mso-position-vertical:absolute;mso-position-vertical-relative:text;mso-width-percent:0;mso-height-percent:0;mso-width-relative:margin;mso-height-relative:margin;v-text-anchor:top" o:gfxdata="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" filled="f" stroked="f">
+              <v:shape w14:anchorId="0DB68382" id="_x0000_s1028" type="#_x0000_t202" style="position:absolute;left:0;text-align:left;margin-left:260.05pt;margin-top:130.45pt;width:92.55pt;height:128.4pt;z-index:251677696;visibility:visible;mso-wrap-style:square;mso-width-percent:0;mso-height-percent:0;mso-wrap-distance-left:9pt;mso-wrap-distance-top:3.6pt;mso-wrap-distance-right:9pt;mso-wrap-distance-bottom:3.6pt;mso-position-horizontal:absolute;mso-position-horizontal-relative:margin;mso-position-vertical:absolute;mso-position-vertical-relative:text;mso-width-percent:0;mso-height-percent:0;mso-width-relative:margin;mso-height-relative:margin;v-text-anchor:top" o:gfxdata="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" filled="f" stroked="f">
                 <v:textbox>
                   <w:txbxContent>
                     <w:p>
@@ -1133,6 +1276,73 @@
                           <w:iCs/>
                         </w:rPr>
                         <w:t>Copilot</w:t>
+                      </w:r>
+                    </w:p>
+                    <w:p>
+                      <w:pPr>
+                        <w:spacing w:after="0"/>
+                        <w:rPr>
+                          <w:i/>
+                          <w:iCs/>
+                        </w:rPr>
+                      </w:pPr>
+                      <w:r>
+                        <w:rPr>
+                          <w:i/>
+                          <w:iCs/>
+                        </w:rPr>
+                        <w:t xml:space="preserve">  </w:t>
+                      </w:r>
+                      <w:r>
+                        <w:rPr>
+                          <w:i/>
+                          <w:iCs/>
+                        </w:rPr>
+                        <w:t xml:space="preserve">• </w:t>
+                      </w:r>
+                      <w:r>
+                        <w:rPr>
+                          <w:i/>
+                          <w:iCs/>
+                        </w:rPr>
+                        <w:t>Kiro</w:t>
+                      </w:r>
+                    </w:p>
+                    <w:p>
+                      <w:pPr>
+                        <w:spacing w:after="0"/>
+                        <w:rPr>
+                          <w:i/>
+                          <w:iCs/>
+                        </w:rPr>
+                      </w:pPr>
+                      <w:r>
+                        <w:rPr>
+                          <w:i/>
+                          <w:iCs/>
+                        </w:rPr>
+                        <w:t xml:space="preserve"> </w:t>
+                      </w:r>
+                      <w:r>
+                        <w:rPr>
+                          <w:i/>
+                          <w:iCs/>
+                        </w:rPr>
+                        <w:t xml:space="preserve"> </w:t>
+                      </w:r>
+                      <w:r>
+                        <w:rPr>
+                          <w:i/>
+                          <w:iCs/>
+                        </w:rPr>
+                        <w:t xml:space="preserve">• </w:t>
+                      </w:r>
+                      <w:r>
+                        <w:rPr>
+                          <w:i/>
+                          <w:iCs/>
+                        </w:rPr>
+                        <w:t>Claude</w:t>
                       </w:r>
                     </w:p>
                     <w:p>
@@ -4288,7 +4498,49 @@
                                 <w:i/>
                                 <w:iCs/>
                               </w:rPr>
-                              <w:t xml:space="preserve">  • </w:t>
+                              <w:t xml:space="preserve"> </w:t>
+                            </w:r>
+                            <w:r>
+                              <w:rPr>
+                                <w:i/>
+                                <w:iCs/>
+                              </w:rPr>
+                              <w:t xml:space="preserve"> • </w:t>
+                            </w:r>
+                            <w:r>
+                              <w:rPr>
+                                <w:i/>
+                                <w:iCs/>
+                              </w:rPr>
+                              <w:t>Spec driven AI Development for all engineering work</w:t>
+                            </w:r>
+                          </w:p>
+                          <w:p>
+                            <w:pPr>
+                              <w:pBdr>
+                                <w:top w:val="single" w:sz="24" w:space="8" w:color="1CADE4" w:themeColor="accent1"/>
+                                <w:bottom w:val="single" w:sz="24" w:space="2" w:color="1CADE4" w:themeColor="accent1"/>
+                              </w:pBdr>
+                              <w:spacing w:after="0"/>
+                              <w:ind w:left="142" w:hanging="142"/>
+                              <w:rPr>
+                                <w:i/>
+                                <w:iCs/>
+                              </w:rPr>
+                            </w:pPr>
+                            <w:r>
+                              <w:rPr>
+                                <w:i/>
+                                <w:iCs/>
+                              </w:rPr>
+                              <w:t xml:space="preserve">  </w:t>
+                            </w:r>
+                            <w:r>
+                              <w:rPr>
+                                <w:i/>
+                                <w:iCs/>
+                              </w:rPr>
+                              <w:t xml:space="preserve">• </w:t>
                             </w:r>
                             <w:r>
                               <w:rPr>
@@ -5080,11 +5332,7 @@
           </mc:Choice>
           <mc:Fallback>
             <w:pict>
-              <v:shapetype w14:anchorId="2A90B16A" id="_x0000_t202" coordsize="21600,21600" o:spt="202" path="m,l,21600r21600,l21600,xe">
-                <v:stroke joinstyle="miter"/>
-                <v:path gradientshapeok="t" o:connecttype="rect"/>
-              </v:shapetype>
-              <v:shape id="_x0000_s1033" type="#_x0000_t202" style="position:absolute;left:0;text-align:left;margin-left:349.3pt;margin-top:103.35pt;width:186.75pt;height:584pt;z-index:251669504;visibility:visible;mso-wrap-style:square;mso-width-percent:0;mso-height-percent:0;mso-wrap-distance-left:9pt;mso-wrap-distance-top:7.2pt;mso-wrap-distance-right:9pt;mso-wrap-distance-bottom:7.2pt;mso-position-horizontal:absolute;mso-position-horizontal-relative:margin;mso-position-vertical:absolute;mso-position-vertical-relative:text;mso-width-percent:0;mso-height-percent:0;mso-width-relative:margin;mso-height-relative:margin;v-text-anchor:top" o:gfxdata="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" filled="f" stroked="f">
+              <v:shape w14:anchorId="2A90B16A" id="_x0000_s1033" type="#_x0000_t202" style="position:absolute;left:0;text-align:left;margin-left:349.3pt;margin-top:103.35pt;width:186.75pt;height:584pt;z-index:251669504;visibility:visible;mso-wrap-style:square;mso-width-percent:0;mso-height-percent:0;mso-wrap-distance-left:9pt;mso-wrap-distance-top:7.2pt;mso-wrap-distance-right:9pt;mso-wrap-distance-bottom:7.2pt;mso-position-horizontal:absolute;mso-position-horizontal-relative:margin;mso-position-vertical:absolute;mso-position-vertical-relative:text;mso-width-percent:0;mso-height-percent:0;mso-width-relative:margin;mso-height-relative:margin;v-text-anchor:top" o:gfxdata="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" filled="f" stroked="f">
                 <v:textbox>
                   <w:txbxContent>
                     <w:p>
@@ -5203,7 +5451,49 @@
                           <w:i/>
                           <w:iCs/>
                         </w:rPr>
-                        <w:t xml:space="preserve">  • </w:t>
+                        <w:t xml:space="preserve"> </w:t>
+                      </w:r>
+                      <w:r>
+                        <w:rPr>
+                          <w:i/>
+                          <w:iCs/>
+                        </w:rPr>
+                        <w:t xml:space="preserve"> • </w:t>
+                      </w:r>
+                      <w:r>
+                        <w:rPr>
+                          <w:i/>
+                          <w:iCs/>
+                        </w:rPr>
+                        <w:t>Spec driven AI Development for all engineering work</w:t>
+                      </w:r>
+                    </w:p>
+                    <w:p>
+                      <w:pPr>
+                        <w:pBdr>
+                          <w:top w:val="single" w:sz="24" w:space="8" w:color="1CADE4" w:themeColor="accent1"/>
+                          <w:bottom w:val="single" w:sz="24" w:space="2" w:color="1CADE4" w:themeColor="accent1"/>
+                        </w:pBdr>
+                        <w:spacing w:after="0"/>
+                        <w:ind w:left="142" w:hanging="142"/>
+                        <w:rPr>
+                          <w:i/>
+                          <w:iCs/>
+                        </w:rPr>
+                      </w:pPr>
+                      <w:r>
+                        <w:rPr>
+                          <w:i/>
+                          <w:iCs/>
+                        </w:rPr>
+                        <w:t xml:space="preserve">  </w:t>
+                      </w:r>
+                      <w:r>
+                        <w:rPr>
+                          <w:i/>
+                          <w:iCs/>
+                        </w:rPr>
+                        <w:t xml:space="preserve">• </w:t>
                       </w:r>
                       <w:r>
                         <w:rPr>

</xml_diff>